<commit_message>
Add UPS carrier (Node + Excel COM finalizer), address transport pole feedback
UPS: full carrier build (billing CSV, no headers, position-based columns),
16-sheet Excel COM finalizer, Demande avoir (1Z79) automation, montant-net=0
and missing-identification row filtering, UI month field made authoritative.

FedEx: broaden Zones eloignees/Colis volumineux PDF keyword extraction
(zone, import US customs charge, oversized handling surcharge).

Colissimo/FedEx: rebuild import CSV/XLSX from the generated workbook's
calculated values instead of a separately computed JS path.

BLS: navette shipments now rebilled to the client (Fret no longer zeroed).
</commit_message>
<xml_diff>
--- a/Documentation/FACTURATION EXCEL.docx
+++ b/Documentation/FACTURATION EXCEL.docx
@@ -43,28 +43,148 @@
         </w:rPr>
         <w:t>Excel</w:t>
       </w:r>
+    </w:p>
+    <w:p>
+      <w:pPr>
+        <w:pStyle w:val="Titre2"/>
+      </w:pPr>
+      <w:r>
+        <w:t>Pour tous les transporteurs</w:t>
+      </w:r>
+    </w:p>
+    <w:p>
+      <w:pPr>
+        <w:pStyle w:val="Titre3"/>
+      </w:pPr>
+      <w:r>
+        <w:t>Dans le fichier de calcul</w:t>
+      </w:r>
+    </w:p>
+    <w:p>
+      <w:pPr>
+        <w:pStyle w:val="Paragraphedeliste"/>
+        <w:numPr>
+          <w:ilvl w:val="1"/>
+          <w:numId w:val="3"/>
+        </w:numPr>
+      </w:pPr>
+      <w:r>
+        <w:t>Ouvrir le fichier du mois précédent et l’enregistrer dans le nouveau mois direct</w:t>
+      </w:r>
+    </w:p>
+    <w:p>
+      <w:pPr>
+        <w:pStyle w:val="Paragraphedeliste"/>
+        <w:numPr>
+          <w:ilvl w:val="1"/>
+          <w:numId w:val="3"/>
+        </w:numPr>
+      </w:pPr>
+      <w:r>
+        <w:t xml:space="preserve">Dans l’onglet des factures faire CTRL MAJ L pour filtrer / </w:t>
+      </w:r>
+      <w:proofErr w:type="spellStart"/>
+      <w:r>
+        <w:t>défiltrer</w:t>
+      </w:r>
+      <w:proofErr w:type="spellEnd"/>
+      <w:r>
+        <w:t xml:space="preserve"> sur la première ligne pour s’assurer que tout est supprimer que tout est pris en compte</w:t>
+      </w:r>
+    </w:p>
+    <w:p>
+      <w:pPr>
+        <w:pStyle w:val="Paragraphedeliste"/>
+        <w:numPr>
+          <w:ilvl w:val="1"/>
+          <w:numId w:val="3"/>
+        </w:numPr>
+      </w:pPr>
+      <w:r>
+        <w:t>B</w:t>
+      </w:r>
+      <w:r>
+        <w:t>ien étirer les colonnes</w:t>
+      </w:r>
+    </w:p>
+    <w:p>
+      <w:pPr>
+        <w:pStyle w:val="Paragraphedeliste"/>
+        <w:numPr>
+          <w:ilvl w:val="1"/>
+          <w:numId w:val="3"/>
+        </w:numPr>
+      </w:pPr>
+      <w:r>
+        <w:t>Supprimer les ID clients</w:t>
+      </w:r>
+    </w:p>
+    <w:p>
+      <w:pPr>
+        <w:pStyle w:val="Paragraphedeliste"/>
+        <w:numPr>
+          <w:ilvl w:val="1"/>
+          <w:numId w:val="3"/>
+        </w:numPr>
+      </w:pPr>
+      <w:r>
+        <w:t>Checker le tarif des PDF avec celle du TCD</w:t>
+      </w:r>
+    </w:p>
+    <w:p>
+      <w:pPr>
+        <w:pStyle w:val="Paragraphedeliste"/>
+        <w:numPr>
+          <w:ilvl w:val="1"/>
+          <w:numId w:val="3"/>
+        </w:numPr>
+      </w:pPr>
+      <w:r>
+        <w:t>Dans import ERP, étendre toutes les colonnes jusqu’à voir le même nombre de lignes que dans le TCD</w:t>
+      </w:r>
+      <w:r>
+        <w:t xml:space="preserve"> + changer date 1ere ligne</w:t>
+      </w:r>
+    </w:p>
+    <w:p>
+      <w:pPr>
+        <w:pStyle w:val="Titre3"/>
+      </w:pPr>
+      <w:r>
+        <w:t>Dans le fichier d’import</w:t>
+      </w:r>
+    </w:p>
+    <w:p>
+      <w:pPr>
+        <w:pStyle w:val="Paragraphedeliste"/>
+        <w:numPr>
+          <w:ilvl w:val="1"/>
+          <w:numId w:val="3"/>
+        </w:numPr>
+      </w:pPr>
+      <w:r>
+        <w:t>Ouvrir le fichier du mois précédent et l’enregistrer dans le nouveau mois direct</w:t>
+      </w:r>
+    </w:p>
+    <w:p>
+      <w:pPr>
+        <w:pStyle w:val="Paragraphedeliste"/>
+        <w:numPr>
+          <w:ilvl w:val="1"/>
+          <w:numId w:val="3"/>
+        </w:numPr>
+      </w:pPr>
+      <w:r>
+        <w:t>Supprimer les anciennes données pour ne pas les réimporter (laisser juste la 1</w:t>
+      </w:r>
       <w:r>
         <w:rPr>
-          <w:b/>
-          <w:bCs/>
+          <w:vertAlign w:val="superscript"/>
         </w:rPr>
-        <w:t xml:space="preserve"> v2</w:t>
-      </w:r>
-    </w:p>
-    <w:p>
-      <w:pPr>
-        <w:pStyle w:val="Titre2"/>
-      </w:pPr>
-      <w:r>
-        <w:t>Pour tous les transporteurs</w:t>
-      </w:r>
-    </w:p>
-    <w:p>
-      <w:pPr>
-        <w:pStyle w:val="Titre3"/>
-      </w:pPr>
-      <w:r>
-        <w:t>Dans le fichier de calcul</w:t>
+        <w:t>ère</w:t>
+      </w:r>
+      <w:r>
+        <w:t xml:space="preserve"> ligne pour voir quelles sont les lignes à remplir</w:t>
       </w:r>
     </w:p>
     <w:p>
@@ -76,7 +196,7 @@
         </w:numPr>
       </w:pPr>
       <w:r>
-        <w:t>Supprimer les ID clients</w:t>
+        <w:t>Checker que le nom du transporteur soit bien mis partout</w:t>
       </w:r>
     </w:p>
     <w:p>
@@ -88,7 +208,10 @@
         </w:numPr>
       </w:pPr>
       <w:r>
-        <w:t>Checker le tarif des PDF avec celle du TCD</w:t>
+        <w:t>Checker que la date soit sous format date courte</w:t>
+      </w:r>
+      <w:r>
+        <w:t xml:space="preserve"> (et le bon mois)</w:t>
       </w:r>
     </w:p>
     <w:p>
@@ -100,18 +223,24 @@
         </w:numPr>
       </w:pPr>
       <w:r>
-        <w:t>Dans import ERP, étendre toutes les colonnes jusqu’à voir le même nombre de lignes que dans le TCD</w:t>
-      </w:r>
-      <w:r>
-        <w:t xml:space="preserve"> + changer date 1ere ligne</w:t>
-      </w:r>
-    </w:p>
-    <w:p>
-      <w:pPr>
-        <w:pStyle w:val="Titre3"/>
-      </w:pPr>
-      <w:r>
-        <w:t>Dans le fichier d’import</w:t>
+        <w:t xml:space="preserve">Checker que </w:t>
+      </w:r>
+      <w:r>
+        <w:t>les numéros</w:t>
+      </w:r>
+      <w:r>
+        <w:t xml:space="preserve"> de </w:t>
+      </w:r>
+      <w:proofErr w:type="spellStart"/>
+      <w:r>
+        <w:t>tracking</w:t>
+      </w:r>
+      <w:proofErr w:type="spellEnd"/>
+      <w:r>
+        <w:t xml:space="preserve"> soient </w:t>
+      </w:r>
+      <w:r>
+        <w:t>corrects</w:t>
       </w:r>
     </w:p>
     <w:p>
@@ -123,7 +252,7 @@
         </w:numPr>
       </w:pPr>
       <w:r>
-        <w:t>Checker que le nom du transporteur soit bien mis partout</w:t>
+        <w:t>Checker qu’il y ai E/P sur toutes les lignes</w:t>
       </w:r>
     </w:p>
     <w:p>
@@ -135,10 +264,7 @@
         </w:numPr>
       </w:pPr>
       <w:r>
-        <w:t>Checker que la date soit sous format date courte</w:t>
-      </w:r>
-      <w:r>
-        <w:t xml:space="preserve"> (et le bon mois)</w:t>
+        <w:t>Checker qu’il n’y ai pas de pays inconnu ou zone inconnue</w:t>
       </w:r>
     </w:p>
     <w:p>
@@ -150,13 +276,25 @@
         </w:numPr>
       </w:pPr>
       <w:r>
-        <w:t xml:space="preserve">Checker que </w:t>
-      </w:r>
-      <w:r>
-        <w:t>les numéros</w:t>
-      </w:r>
-      <w:r>
-        <w:t xml:space="preserve"> de </w:t>
+        <w:t>Checker qu’il n’y ai pas de colis = 0</w:t>
+      </w:r>
+    </w:p>
+    <w:p>
+      <w:pPr>
+        <w:pStyle w:val="Paragraphedeliste"/>
+        <w:numPr>
+          <w:ilvl w:val="1"/>
+          <w:numId w:val="3"/>
+        </w:numPr>
+      </w:pPr>
+      <w:r>
+        <w:t xml:space="preserve">Checker qu’il n’y ai pas de poids = 0 </w:t>
+      </w:r>
+      <w:r>
+        <w:t>kg</w:t>
+      </w:r>
+      <w:r>
+        <w:t xml:space="preserve"> =&gt; comparer à l’export ERP ou à l’ERP ou au </w:t>
       </w:r>
       <w:proofErr w:type="spellStart"/>
       <w:r>
@@ -164,10 +302,7 @@
       </w:r>
       <w:proofErr w:type="spellEnd"/>
       <w:r>
-        <w:t xml:space="preserve"> soient </w:t>
-      </w:r>
-      <w:r>
-        <w:t>corrects</w:t>
+        <w:t xml:space="preserve"> sur le suivi du transporteur</w:t>
       </w:r>
     </w:p>
     <w:p>
@@ -179,8 +314,21 @@
         </w:numPr>
       </w:pPr>
       <w:r>
-        <w:t>Checker qu’il y ai E/P sur toutes les lignes</w:t>
-      </w:r>
+        <w:t>Checker que les poids possèdent 1 décimale après la virgule (si besoin faire un =</w:t>
+      </w:r>
+      <w:proofErr w:type="spellStart"/>
+      <w:r>
+        <w:t>arrondisup</w:t>
+      </w:r>
+      <w:proofErr w:type="spellEnd"/>
+      <w:r>
+        <w:t xml:space="preserve"> dans le fichier de calcul) : cela permet d’éviter les avaries de prix après dans </w:t>
+      </w:r>
+      <w:proofErr w:type="spellStart"/>
+      <w:r>
+        <w:t>l’erp</w:t>
+      </w:r>
+      <w:proofErr w:type="spellEnd"/>
     </w:p>
     <w:p>
       <w:pPr>
@@ -191,169 +339,15 @@
         </w:numPr>
       </w:pPr>
       <w:r>
-        <w:t>Checker qu’il n’y ai pas de pays inconnu ou zone inconnue</w:t>
-      </w:r>
-    </w:p>
-    <w:p>
-      <w:pPr>
-        <w:pStyle w:val="Paragraphedeliste"/>
-        <w:numPr>
-          <w:ilvl w:val="1"/>
-          <w:numId w:val="3"/>
-        </w:numPr>
-      </w:pPr>
-      <w:r>
-        <w:t>Checker qu’il n’y ai pas de colis = 0</w:t>
-      </w:r>
-    </w:p>
-    <w:p>
-      <w:pPr>
-        <w:pStyle w:val="Paragraphedeliste"/>
-        <w:numPr>
-          <w:ilvl w:val="1"/>
-          <w:numId w:val="3"/>
-        </w:numPr>
-      </w:pPr>
-      <w:r>
-        <w:t xml:space="preserve">Checker qu’il n’y ai pas de poids = 0 </w:t>
-      </w:r>
-      <w:r>
-        <w:t>kg</w:t>
-      </w:r>
-      <w:r>
-        <w:t xml:space="preserve"> =&gt; comparer à l’export </w:t>
-      </w:r>
-      <w:r>
-        <w:t>des expéditions bruts du moi m ou m-1</w:t>
-      </w:r>
-    </w:p>
-    <w:p>
-      <w:pPr>
-        <w:pStyle w:val="Paragraphedeliste"/>
-        <w:numPr>
-          <w:ilvl w:val="1"/>
-          <w:numId w:val="3"/>
-        </w:numPr>
-      </w:pPr>
-      <w:r>
-        <w:t>Checker que les poids possèdent 1 décimale après la virgule (si besoin faire un =</w:t>
+        <w:t xml:space="preserve">Checker de ne pas avoir de </w:t>
       </w:r>
       <w:proofErr w:type="spellStart"/>
       <w:r>
-        <w:t>arrondisup</w:t>
+        <w:t>frêt</w:t>
       </w:r>
       <w:proofErr w:type="spellEnd"/>
       <w:r>
-        <w:t xml:space="preserve"> dans le fichier de calcul) : cela permet d’éviter les avaries de prix après dans </w:t>
-      </w:r>
-      <w:proofErr w:type="spellStart"/>
-      <w:r>
-        <w:t>l’erp</w:t>
-      </w:r>
-      <w:proofErr w:type="spellEnd"/>
-    </w:p>
-    <w:p>
-      <w:pPr>
-        <w:pStyle w:val="Paragraphedeliste"/>
-        <w:numPr>
-          <w:ilvl w:val="1"/>
-          <w:numId w:val="3"/>
-        </w:numPr>
-      </w:pPr>
-      <w:r>
-        <w:t xml:space="preserve">Checker de ne pas avoir de </w:t>
-      </w:r>
-      <w:proofErr w:type="spellStart"/>
-      <w:r>
-        <w:t>frêt</w:t>
-      </w:r>
-      <w:proofErr w:type="spellEnd"/>
-      <w:r>
-        <w:t xml:space="preserve"> à 0</w:t>
-      </w:r>
-      <w:proofErr w:type="gramStart"/>
-      <w:r>
-        <w:t>€</w:t>
-      </w:r>
-      <w:r>
-        <w:t xml:space="preserve">  si</w:t>
-      </w:r>
-      <w:proofErr w:type="gramEnd"/>
-      <w:r>
-        <w:t xml:space="preserve"> </w:t>
-      </w:r>
-      <w:proofErr w:type="gramStart"/>
-      <w:r>
-        <w:t>oui ,</w:t>
-      </w:r>
-      <w:proofErr w:type="gramEnd"/>
-      <w:r>
-        <w:t xml:space="preserve"> enlever le </w:t>
-      </w:r>
-      <w:proofErr w:type="spellStart"/>
-      <w:r>
-        <w:t>zero</w:t>
-      </w:r>
-      <w:proofErr w:type="spellEnd"/>
-      <w:r>
-        <w:t xml:space="preserve"> et rien mettre </w:t>
-      </w:r>
-    </w:p>
-    <w:p>
-      <w:pPr>
-        <w:pStyle w:val="Paragraphedeliste"/>
-        <w:numPr>
-          <w:ilvl w:val="1"/>
-          <w:numId w:val="3"/>
-        </w:numPr>
-      </w:pPr>
-      <w:proofErr w:type="gramStart"/>
-      <w:r>
-        <w:t>si</w:t>
-      </w:r>
-      <w:proofErr w:type="gramEnd"/>
-      <w:r>
-        <w:t xml:space="preserve"> fret </w:t>
-      </w:r>
-      <w:proofErr w:type="gramStart"/>
-      <w:r>
-        <w:t>vide  et</w:t>
-      </w:r>
-      <w:proofErr w:type="gramEnd"/>
-      <w:r>
-        <w:t xml:space="preserve"> colonne de droits et taxes jusqu’à colonne adresse est à 0 ou vide = supprimer la ligne </w:t>
-      </w:r>
-      <w:proofErr w:type="gramStart"/>
-      <w:r>
-        <w:t>entière ,</w:t>
-      </w:r>
-      <w:proofErr w:type="gramEnd"/>
-      <w:r>
-        <w:t xml:space="preserve"> si </w:t>
-      </w:r>
-      <w:proofErr w:type="spellStart"/>
-      <w:r>
-        <w:t>frete</w:t>
-      </w:r>
-      <w:proofErr w:type="spellEnd"/>
-      <w:r>
-        <w:t xml:space="preserve"> vide et au moins une de ces colonnes </w:t>
-      </w:r>
-      <w:proofErr w:type="gramStart"/>
-      <w:r>
-        <w:t>a</w:t>
-      </w:r>
-      <w:proofErr w:type="gramEnd"/>
-      <w:r>
-        <w:t xml:space="preserve"> une </w:t>
-      </w:r>
-      <w:proofErr w:type="gramStart"/>
-      <w:r>
-        <w:t>information ,</w:t>
-      </w:r>
-      <w:proofErr w:type="gramEnd"/>
-      <w:r>
-        <w:t xml:space="preserve"> laisser la ligne </w:t>
+        <w:t xml:space="preserve"> à 0€</w:t>
       </w:r>
     </w:p>
     <w:p>
@@ -851,16 +845,8 @@
       <w:pPr>
         <w:pStyle w:val="Titre2"/>
       </w:pPr>
-      <w:proofErr w:type="gramStart"/>
       <w:r>
         <w:t>Geodis</w:t>
-      </w:r>
-      <w:r>
-        <w:t xml:space="preserve">  (</w:t>
-      </w:r>
-      <w:proofErr w:type="gramEnd"/>
-      <w:r>
-        <w:t xml:space="preserve"> en cours) </w:t>
       </w:r>
     </w:p>
     <w:p>
@@ -1756,7 +1742,6 @@
         <w:t>Fille Viticolis</w:t>
       </w:r>
     </w:p>
-    <w:p/>
     <w:p>
       <w:pPr>
         <w:pStyle w:val="Paragraphedeliste"/>
@@ -1891,11 +1876,6 @@
     </w:p>
     <w:p>
       <w:pPr>
-        <w:spacing w:after="0"/>
-      </w:pPr>
-    </w:p>
-    <w:p>
-      <w:pPr>
         <w:pStyle w:val="Titre3"/>
       </w:pPr>
       <w:r>
@@ -2283,33 +2263,65 @@
           <w:numId w:val="4"/>
         </w:numPr>
         <w:spacing w:after="0"/>
-      </w:pPr>
-      <w:r>
+        <w:rPr>
+          <w:strike/>
+        </w:rPr>
+      </w:pPr>
+      <w:r>
+        <w:rPr>
+          <w:strike/>
+        </w:rPr>
+        <w:t xml:space="preserve">Obsolète : </w:t>
+      </w:r>
+      <w:r>
+        <w:rPr>
+          <w:strike/>
+        </w:rPr>
         <w:t xml:space="preserve">Dans colonne A mettre </w:t>
       </w:r>
       <w:proofErr w:type="spellStart"/>
       <w:r>
+        <w:rPr>
+          <w:strike/>
+        </w:rPr>
         <w:t>recherchex</w:t>
       </w:r>
       <w:proofErr w:type="spellEnd"/>
       <w:r>
+        <w:rPr>
+          <w:strike/>
+        </w:rPr>
         <w:t xml:space="preserve"> avec export ERP sur toutes les lignes faire avec export mois-1 et mois-2 pour retrouver le nombre de colis</w:t>
       </w:r>
       <w:r>
-        <w:t xml:space="preserve"> (ça permet d’avoir un </w:t>
-      </w:r>
+        <w:rPr>
+          <w:strike/>
+        </w:rPr>
+        <w:t xml:space="preserve"> (ça permet d’avoir un nombre de colis &gt; 0 pour pouvoir facturer les adresses par nombre de colis) si des cases sont encore vide, regarder à la main</w:t>
+      </w:r>
+      <w:r>
+        <w:rPr>
+          <w:strike/>
+        </w:rPr>
+        <w:t xml:space="preserve"> dans l’ERP</w:t>
+      </w:r>
+    </w:p>
+    <w:p>
+      <w:pPr>
+        <w:pStyle w:val="Paragraphedeliste"/>
+        <w:numPr>
+          <w:ilvl w:val="1"/>
+          <w:numId w:val="4"/>
+        </w:numPr>
+        <w:spacing w:after="0"/>
+      </w:pPr>
       <w:r>
         <w:lastRenderedPageBreak/>
-        <w:t>nombre de colis &gt; 0 pour pouvoir facturer les adresses par nombre de colis) si des cases sont encore vide, regarder à la main</w:t>
-      </w:r>
-      <w:r>
-        <w:t xml:space="preserve"> dans l’ERP</w:t>
-      </w:r>
-    </w:p>
-    <w:p>
-      <w:pPr>
-        <w:spacing w:after="0"/>
-      </w:pPr>
+        <w:t>Vérifier onglet adresse si on est toujours gagnant à facturer</w:t>
+      </w:r>
+      <w:r>
+        <w:t xml:space="preserve"> les adresses à l’expédition et non au colis comme le fait UPS (si on est perdant, faire la manip obsolète)</w:t>
+      </w:r>
     </w:p>
     <w:p>
       <w:pPr>
@@ -4433,6 +4445,98 @@
               </w:rPr>
               <w:t>12</w:t>
             </w:r>
+          </w:p>
+        </w:tc>
+        <w:tc>
+          <w:tcPr>
+            <w:tcW w:w="1755" w:type="dxa"/>
+          </w:tcPr>
+          <w:p>
+            <w:pPr>
+              <w:rPr>
+                <w:rFonts w:asciiTheme="majorHAnsi" w:eastAsiaTheme="majorEastAsia" w:hAnsiTheme="majorHAnsi" w:cstheme="majorBidi"/>
+              </w:rPr>
+            </w:pPr>
+          </w:p>
+        </w:tc>
+      </w:tr>
+      <w:tr>
+        <w:tc>
+          <w:tcPr>
+            <w:tcW w:w="815" w:type="dxa"/>
+          </w:tcPr>
+          <w:p>
+            <w:pPr>
+              <w:rPr>
+                <w:rFonts w:asciiTheme="majorHAnsi" w:eastAsiaTheme="majorEastAsia" w:hAnsiTheme="majorHAnsi" w:cstheme="majorBidi"/>
+              </w:rPr>
+            </w:pPr>
+            <w:r>
+              <w:rPr>
+                <w:rFonts w:asciiTheme="majorHAnsi" w:eastAsiaTheme="majorEastAsia" w:hAnsiTheme="majorHAnsi" w:cstheme="majorBidi"/>
+              </w:rPr>
+              <w:t>DE</w:t>
+            </w:r>
+          </w:p>
+        </w:tc>
+        <w:tc>
+          <w:tcPr>
+            <w:tcW w:w="1182" w:type="dxa"/>
+          </w:tcPr>
+          <w:p>
+            <w:pPr>
+              <w:rPr>
+                <w:rFonts w:asciiTheme="majorHAnsi" w:eastAsiaTheme="majorEastAsia" w:hAnsiTheme="majorHAnsi" w:cstheme="majorBidi"/>
+              </w:rPr>
+            </w:pPr>
+            <w:r>
+              <w:rPr>
+                <w:rFonts w:asciiTheme="majorHAnsi" w:eastAsiaTheme="majorEastAsia" w:hAnsiTheme="majorHAnsi" w:cstheme="majorBidi"/>
+              </w:rPr>
+              <w:t>3</w:t>
+            </w:r>
+          </w:p>
+        </w:tc>
+        <w:tc>
+          <w:tcPr>
+            <w:tcW w:w="1798" w:type="dxa"/>
+          </w:tcPr>
+          <w:p>
+            <w:pPr>
+              <w:rPr>
+                <w:rFonts w:asciiTheme="majorHAnsi" w:eastAsiaTheme="majorEastAsia" w:hAnsiTheme="majorHAnsi" w:cstheme="majorBidi"/>
+              </w:rPr>
+            </w:pPr>
+            <w:r>
+              <w:rPr>
+                <w:rFonts w:asciiTheme="majorHAnsi" w:eastAsiaTheme="majorEastAsia" w:hAnsiTheme="majorHAnsi" w:cstheme="majorBidi"/>
+              </w:rPr>
+              <w:t>4 5 6 7</w:t>
+            </w:r>
+          </w:p>
+        </w:tc>
+        <w:tc>
+          <w:tcPr>
+            <w:tcW w:w="1755" w:type="dxa"/>
+          </w:tcPr>
+          <w:p>
+            <w:pPr>
+              <w:rPr>
+                <w:rFonts w:asciiTheme="majorHAnsi" w:eastAsiaTheme="majorEastAsia" w:hAnsiTheme="majorHAnsi" w:cstheme="majorBidi"/>
+              </w:rPr>
+            </w:pPr>
+          </w:p>
+        </w:tc>
+        <w:tc>
+          <w:tcPr>
+            <w:tcW w:w="1755" w:type="dxa"/>
+          </w:tcPr>
+          <w:p>
+            <w:pPr>
+              <w:rPr>
+                <w:rFonts w:asciiTheme="majorHAnsi" w:eastAsiaTheme="majorEastAsia" w:hAnsiTheme="majorHAnsi" w:cstheme="majorBidi"/>
+              </w:rPr>
+            </w:pPr>
           </w:p>
         </w:tc>
         <w:tc>
@@ -5952,15 +6056,7 @@
         <w:spacing w:after="0"/>
       </w:pPr>
       <w:r>
-        <w:t xml:space="preserve">Colonne D : </w:t>
-      </w:r>
-      <w:proofErr w:type="gramStart"/>
-      <w:r>
-        <w:t>faire</w:t>
-      </w:r>
-      <w:proofErr w:type="gramEnd"/>
-      <w:r>
-        <w:t xml:space="preserve"> une recherche x avec les exports des expéditions brut m et m-1 pour savoir si entreprise ou particulier</w:t>
+        <w:t>Colonne D : faire une recherche x avec les exports des expéditions brut m et m-1 pour savoir si entreprise ou particulier</w:t>
       </w:r>
     </w:p>
     <w:p>
@@ -6065,8 +6161,239 @@
     </w:p>
     <w:p>
       <w:pPr>
-        <w:spacing w:after="0"/>
-      </w:pPr>
+        <w:pStyle w:val="Titre3"/>
+      </w:pPr>
+      <w:r>
+        <w:t xml:space="preserve">Dans le fichier </w:t>
+      </w:r>
+      <w:r>
+        <w:t>import</w:t>
+      </w:r>
+    </w:p>
+    <w:p>
+      <w:pPr>
+        <w:spacing w:after="0"/>
+      </w:pPr>
+      <w:r>
+        <w:t>Rechercher les mots clés « zone » « </w:t>
+      </w:r>
+      <w:proofErr w:type="spellStart"/>
+      <w:proofErr w:type="gramStart"/>
+      <w:r>
+        <w:t>demand</w:t>
+      </w:r>
+      <w:proofErr w:type="spellEnd"/>
+      <w:r>
+        <w:t>»</w:t>
+      </w:r>
+      <w:proofErr w:type="gramEnd"/>
+      <w:r>
+        <w:t> « </w:t>
+      </w:r>
+      <w:r>
+        <w:t xml:space="preserve">Charge pour dépassement de </w:t>
+      </w:r>
+      <w:proofErr w:type="gramStart"/>
+      <w:r>
+        <w:t>dimension</w:t>
+      </w:r>
+      <w:r>
+        <w:t>»</w:t>
+      </w:r>
+      <w:proofErr w:type="gramEnd"/>
+      <w:r>
+        <w:t xml:space="preserve"> </w:t>
+      </w:r>
+      <w:r>
+        <w:t>« </w:t>
+      </w:r>
+      <w:r>
+        <w:t xml:space="preserve">Frais de traitement des importations aux </w:t>
+      </w:r>
+      <w:proofErr w:type="spellStart"/>
+      <w:r>
+        <w:t>États-Uni</w:t>
+      </w:r>
+      <w:proofErr w:type="spellEnd"/>
+      <w:r>
+        <w:t> » « </w:t>
+      </w:r>
+      <w:r>
+        <w:t>plusieurs pièces</w:t>
+      </w:r>
+      <w:r>
+        <w:t xml:space="preserve"> » </w:t>
+      </w:r>
+      <w:r>
+        <w:t>et rajouter manuellement les surplus dans zones éloignés ou colis volumineux</w:t>
+      </w:r>
+      <w:r>
+        <w:t xml:space="preserve"> ou </w:t>
+      </w:r>
+      <w:proofErr w:type="spellStart"/>
+      <w:r>
+        <w:t>plus value</w:t>
+      </w:r>
+      <w:proofErr w:type="spellEnd"/>
+      <w:r>
+        <w:t xml:space="preserve"> b2c</w:t>
+      </w:r>
+    </w:p>
+    <w:p>
+      <w:pPr>
+        <w:spacing w:after="0"/>
+      </w:pPr>
+    </w:p>
+    <w:p>
+      <w:pPr>
+        <w:spacing w:after="0"/>
+      </w:pPr>
+      <w:r>
+        <w:t xml:space="preserve">Fedex </w:t>
+      </w:r>
+      <w:proofErr w:type="spellStart"/>
+      <w:r>
+        <w:t>Internationnal</w:t>
+      </w:r>
+      <w:proofErr w:type="spellEnd"/>
+      <w:r>
+        <w:t xml:space="preserve"> : nombre de colis =1 sinon avarie incompatibilité mode transport </w:t>
+      </w:r>
+      <w:proofErr w:type="spellStart"/>
+      <w:r>
+        <w:t>multicolis</w:t>
+      </w:r>
+      <w:proofErr w:type="spellEnd"/>
+    </w:p>
+    <w:p>
+      <w:pPr>
+        <w:spacing w:after="0"/>
+      </w:pPr>
+    </w:p>
+    <w:p>
+      <w:pPr>
+        <w:spacing w:after="0"/>
+        <w:rPr>
+          <w:i/>
+          <w:iCs/>
+        </w:rPr>
+      </w:pPr>
+      <w:r>
+        <w:rPr>
+          <w:i/>
+          <w:iCs/>
+        </w:rPr>
+        <w:t>Attention le jour où nous ne sommes plus facturés des surcharges High Density (72</w:t>
+      </w:r>
+      <w:r>
+        <w:rPr>
+          <w:i/>
+          <w:iCs/>
+          <w:vertAlign w:val="superscript"/>
+        </w:rPr>
+        <w:t xml:space="preserve"> </w:t>
+      </w:r>
+      <w:r>
+        <w:rPr>
+          <w:i/>
+          <w:iCs/>
+        </w:rPr>
+        <w:t>€) et manutention (35 €) il faudra penser à modifier la formule colonne A pour qu’elle prenne la colonne BL (</w:t>
+      </w:r>
+      <w:proofErr w:type="spellStart"/>
+      <w:r>
+        <w:rPr>
+          <w:i/>
+          <w:iCs/>
+        </w:rPr>
+        <w:t>Shipment</w:t>
+      </w:r>
+      <w:proofErr w:type="spellEnd"/>
+      <w:r>
+        <w:rPr>
+          <w:i/>
+          <w:iCs/>
+        </w:rPr>
+        <w:t xml:space="preserve"> </w:t>
+      </w:r>
+      <w:proofErr w:type="spellStart"/>
+      <w:r>
+        <w:rPr>
+          <w:i/>
+          <w:iCs/>
+        </w:rPr>
+        <w:t>Miscellaneous</w:t>
+      </w:r>
+      <w:proofErr w:type="spellEnd"/>
+      <w:r>
+        <w:rPr>
+          <w:i/>
+          <w:iCs/>
+        </w:rPr>
+        <w:t xml:space="preserve"> Charge </w:t>
+      </w:r>
+      <w:proofErr w:type="spellStart"/>
+      <w:r>
+        <w:rPr>
+          <w:i/>
+          <w:iCs/>
+        </w:rPr>
+        <w:t>Billed</w:t>
+      </w:r>
+      <w:proofErr w:type="spellEnd"/>
+      <w:r>
+        <w:rPr>
+          <w:i/>
+          <w:iCs/>
+        </w:rPr>
+        <w:t xml:space="preserve"> Currency</w:t>
+      </w:r>
+      <w:r>
+        <w:rPr>
+          <w:i/>
+          <w:iCs/>
+        </w:rPr>
+        <w:t xml:space="preserve">) = TVA du </w:t>
+      </w:r>
+      <w:proofErr w:type="spellStart"/>
+      <w:r>
+        <w:rPr>
+          <w:i/>
+          <w:iCs/>
+        </w:rPr>
+        <w:t>frêt</w:t>
+      </w:r>
+      <w:proofErr w:type="spellEnd"/>
+      <w:r>
+        <w:rPr>
+          <w:i/>
+          <w:iCs/>
+        </w:rPr>
+        <w:t xml:space="preserve"> (BK+BM) + Suppléments TTC + TG TTC</w:t>
+      </w:r>
+    </w:p>
+    <w:p>
+      <w:pPr>
+        <w:spacing w:after="0"/>
+        <w:rPr>
+          <w:i/>
+          <w:iCs/>
+        </w:rPr>
+      </w:pPr>
+      <w:r>
+        <w:rPr>
+          <w:i/>
+          <w:iCs/>
+        </w:rPr>
+        <w:t xml:space="preserve">Il faudra </w:t>
+      </w:r>
+      <w:r>
+        <w:rPr>
+          <w:i/>
+          <w:iCs/>
+        </w:rPr>
+        <w:t>refaire une formule afin de garder uniquement les suppléments et les mettre en HT</w:t>
+      </w:r>
     </w:p>
     <w:p>
       <w:pPr>
@@ -6653,11 +6980,30 @@
       </w:r>
       <w:proofErr w:type="spellEnd"/>
       <w:r>
-        <w:t xml:space="preserve"> et ouvrir le CSV prestation Colis</w:t>
-      </w:r>
-      <w:r>
-        <w:t xml:space="preserve"> et douanes</w:t>
-      </w:r>
+        <w:t xml:space="preserve"> et ouvrir le CSV </w:t>
+      </w:r>
+      <w:proofErr w:type="spellStart"/>
+      <w:r>
+        <w:t>prestation</w:t>
+      </w:r>
+      <w:r>
+        <w:t>_au_</w:t>
+      </w:r>
+      <w:r>
+        <w:t>Colis</w:t>
+      </w:r>
+      <w:proofErr w:type="spellEnd"/>
+      <w:r>
+        <w:t xml:space="preserve"> et </w:t>
+      </w:r>
+      <w:proofErr w:type="spellStart"/>
+      <w:r>
+        <w:t>Frais_de_</w:t>
+      </w:r>
+      <w:r>
+        <w:t>douanes</w:t>
+      </w:r>
+      <w:proofErr w:type="spellEnd"/>
     </w:p>
     <w:p>
       <w:pPr>
@@ -6698,7 +7044,42 @@
         <w:spacing w:after="0"/>
       </w:pPr>
       <w:r>
-        <w:t>Coller dans facture Colissimo à partir de la colonne H</w:t>
+        <w:t xml:space="preserve">Copier </w:t>
+      </w:r>
+      <w:proofErr w:type="spellStart"/>
+      <w:r>
+        <w:t>prestation_au_colis</w:t>
+      </w:r>
+      <w:proofErr w:type="spellEnd"/>
+      <w:r>
+        <w:t xml:space="preserve"> et c</w:t>
+      </w:r>
+      <w:r>
+        <w:t>oller dans facture Colissimo à partir de la colonne H</w:t>
+      </w:r>
+      <w:r>
+        <w:t xml:space="preserve"> </w:t>
+      </w:r>
+    </w:p>
+    <w:p>
+      <w:pPr>
+        <w:pStyle w:val="Paragraphedeliste"/>
+        <w:numPr>
+          <w:ilvl w:val="1"/>
+          <w:numId w:val="8"/>
+        </w:numPr>
+        <w:spacing w:after="0"/>
+      </w:pPr>
+      <w:r>
+        <w:t xml:space="preserve">Copier colonne A à H et coller colonne H à O </w:t>
+      </w:r>
+      <w:proofErr w:type="gramStart"/>
+      <w:r>
+        <w:t>-  Copier</w:t>
+      </w:r>
+      <w:proofErr w:type="gramEnd"/>
+      <w:r>
+        <w:t xml:space="preserve"> N à R et coller colonne AA à AE</w:t>
       </w:r>
     </w:p>
     <w:p>
@@ -7175,7 +7556,13 @@
         <w:spacing w:after="0"/>
       </w:pPr>
       <w:r>
-        <w:t>Trier Colonne C de A à Z</w:t>
+        <w:t xml:space="preserve">Trier Colonne </w:t>
+      </w:r>
+      <w:r>
+        <w:t>D</w:t>
+      </w:r>
+      <w:r>
+        <w:t xml:space="preserve"> de A à Z</w:t>
       </w:r>
     </w:p>
     <w:p>
@@ -7189,6 +7576,9 @@
       </w:pPr>
       <w:r>
         <w:t>Etendre colonne B</w:t>
+      </w:r>
+      <w:r>
+        <w:t xml:space="preserve"> et C</w:t>
       </w:r>
     </w:p>
     <w:p>
@@ -7219,7 +7609,6 @@
         <w:spacing w:after="0"/>
       </w:pPr>
       <w:r>
-        <w:lastRenderedPageBreak/>
         <w:t xml:space="preserve">Onglet Bilan Facture </w:t>
       </w:r>
     </w:p>
@@ -7246,7 +7635,64 @@
         <w:spacing w:after="0"/>
       </w:pPr>
       <w:r>
-        <w:t>Mettre le prix PDF HT et montant indemnisation pour comparer écart</w:t>
+        <w:t>Mettre le prix PDF HT</w:t>
+      </w:r>
+      <w:r>
+        <w:t>,</w:t>
+      </w:r>
+      <w:r>
+        <w:t xml:space="preserve"> montant indemnisation </w:t>
+      </w:r>
+      <w:r>
+        <w:t xml:space="preserve">et montant douane </w:t>
+      </w:r>
+      <w:r>
+        <w:t>pour comparer écart</w:t>
+      </w:r>
+      <w:r>
+        <w:t xml:space="preserve"> (en enlevant les -)</w:t>
+      </w:r>
+    </w:p>
+    <w:p>
+      <w:pPr>
+        <w:spacing w:after="0"/>
+      </w:pPr>
+      <w:r>
+        <w:drawing>
+          <wp:inline distT="0" distB="0" distL="0" distR="0" wp14:anchorId="079CE687" wp14:editId="042064A9">
+            <wp:extent cx="4819650" cy="2721747"/>
+            <wp:effectExtent l="0" t="0" r="0" b="2540"/>
+            <wp:docPr id="1091467669" name="Image 1"/>
+            <wp:cNvGraphicFramePr>
+              <a:graphicFrameLocks xmlns:a="http://schemas.openxmlformats.org/drawingml/2006/main" noChangeAspect="1"/>
+            </wp:cNvGraphicFramePr>
+            <a:graphic xmlns:a="http://schemas.openxmlformats.org/drawingml/2006/main">
+              <a:graphicData uri="http://schemas.openxmlformats.org/drawingml/2006/picture">
+                <pic:pic xmlns:pic="http://schemas.openxmlformats.org/drawingml/2006/picture">
+                  <pic:nvPicPr>
+                    <pic:cNvPr id="1091467669" name=""/>
+                    <pic:cNvPicPr/>
+                  </pic:nvPicPr>
+                  <pic:blipFill>
+                    <a:blip r:embed="rId18"/>
+                    <a:stretch>
+                      <a:fillRect/>
+                    </a:stretch>
+                  </pic:blipFill>
+                  <pic:spPr>
+                    <a:xfrm>
+                      <a:off x="0" y="0"/>
+                      <a:ext cx="4823348" cy="2723835"/>
+                    </a:xfrm>
+                    <a:prstGeom prst="rect">
+                      <a:avLst/>
+                    </a:prstGeom>
+                  </pic:spPr>
+                </pic:pic>
+              </a:graphicData>
+            </a:graphic>
+          </wp:inline>
+        </w:drawing>
       </w:r>
     </w:p>
     <w:p>
@@ -7725,7 +8171,7 @@
       <w:r>
         <w:t xml:space="preserve">Sur leur site : </w:t>
       </w:r>
-      <w:hyperlink r:id="rId18" w:history="1">
+      <w:hyperlink r:id="rId19" w:history="1">
         <w:r>
           <w:rPr>
             <w:rStyle w:val="Lienhypertexte"/>
@@ -7758,7 +8204,7 @@
                     <pic:cNvPicPr/>
                   </pic:nvPicPr>
                   <pic:blipFill>
-                    <a:blip r:embed="rId19"/>
+                    <a:blip r:embed="rId20"/>
                     <a:stretch>
                       <a:fillRect/>
                     </a:stretch>
@@ -7855,7 +8301,13 @@
         </w:numPr>
       </w:pPr>
       <w:r>
-        <w:t>Dans colonne AF vérifier :</w:t>
+        <w:t>Dans colonne A</w:t>
+      </w:r>
+      <w:r>
+        <w:t>G</w:t>
+      </w:r>
+      <w:r>
+        <w:t xml:space="preserve"> vérifier :</w:t>
       </w:r>
     </w:p>
     <w:p>
@@ -7939,7 +8391,13 @@
         </w:numPr>
       </w:pPr>
       <w:r>
-        <w:t>AG8 : Taxe gasoil routier chrono dispo su</w:t>
+        <w:t>A</w:t>
+      </w:r>
+      <w:r>
+        <w:t>H</w:t>
+      </w:r>
+      <w:r>
+        <w:t>8 : Taxe gasoil routier chrono dispo su</w:t>
       </w:r>
       <w:r>
         <w:t>r leur site</w:t>
@@ -7954,7 +8412,13 @@
         </w:numPr>
       </w:pPr>
       <w:r>
-        <w:t xml:space="preserve">AG9 : Taxe gasoil aérien chrono </w:t>
+        <w:t>A</w:t>
+      </w:r>
+      <w:r>
+        <w:t>H</w:t>
+      </w:r>
+      <w:r>
+        <w:t xml:space="preserve">9 : Taxe gasoil aérien chrono </w:t>
       </w:r>
       <w:r>
         <w:t>dispo sur leur site</w:t>
@@ -7969,7 +8433,22 @@
         </w:numPr>
       </w:pPr>
       <w:r>
-        <w:t>Etirer les colonne W à AC</w:t>
+        <w:t>Etirer les colonne W à A</w:t>
+      </w:r>
+      <w:r>
+        <w:t>D</w:t>
+      </w:r>
+    </w:p>
+    <w:p>
+      <w:pPr>
+        <w:pStyle w:val="Paragraphedeliste"/>
+        <w:numPr>
+          <w:ilvl w:val="1"/>
+          <w:numId w:val="13"/>
+        </w:numPr>
+      </w:pPr>
+      <w:r>
+        <w:t>Transformer colonne S et colonne C en nombre</w:t>
       </w:r>
     </w:p>
     <w:p>
@@ -8166,6 +8645,7 @@
         </w:numPr>
       </w:pPr>
       <w:r>
+        <w:lastRenderedPageBreak/>
         <w:t>Supprimer lignes CAP ECO SUR</w:t>
       </w:r>
     </w:p>
@@ -8178,7 +8658,6 @@
         </w:numPr>
       </w:pPr>
       <w:r>
-        <w:lastRenderedPageBreak/>
         <w:t xml:space="preserve">Vérifier que la somme totale + </w:t>
       </w:r>
       <w:r>
@@ -8197,7 +8676,31 @@
         </w:numPr>
       </w:pPr>
       <w:r>
-        <w:t>Mode d’envoi / zone</w:t>
+        <w:t xml:space="preserve">Colonne E/P : vérifier que le mode d’envoi 1S est uniquement en E le reste en P (grille tarifaire 1S existe uniquement en E, </w:t>
+      </w:r>
+      <w:r>
+        <w:t>les autres modes</w:t>
+      </w:r>
+      <w:r>
+        <w:t xml:space="preserve"> d’envoi ont le même tarif en E ou P)</w:t>
+      </w:r>
+    </w:p>
+    <w:p>
+      <w:pPr>
+        <w:pStyle w:val="Paragraphedeliste"/>
+        <w:numPr>
+          <w:ilvl w:val="0"/>
+          <w:numId w:val="13"/>
+        </w:numPr>
+      </w:pPr>
+      <w:r>
+        <w:t>Zone</w:t>
+      </w:r>
+      <w:r>
+        <w:t xml:space="preserve"> / </w:t>
+      </w:r>
+      <w:r>
+        <w:t>Mode envoi</w:t>
       </w:r>
     </w:p>
     <w:p>
@@ -8409,7 +8912,13 @@
         <w:spacing w:after="0"/>
       </w:pPr>
       <w:r>
-        <w:t xml:space="preserve">Supprimer toutes les lignes à 0 colonne BB </w:t>
+        <w:t>Supprimer toutes les lignes à 0 colonne B</w:t>
+      </w:r>
+      <w:r>
+        <w:t>A</w:t>
+      </w:r>
+      <w:r>
+        <w:t xml:space="preserve"> </w:t>
       </w:r>
     </w:p>
     <w:p>
@@ -8709,8 +9218,8 @@
       </w:pPr>
     </w:p>
     <w:sectPr>
-      <w:headerReference w:type="default" r:id="rId20"/>
-      <w:footerReference w:type="default" r:id="rId21"/>
+      <w:headerReference w:type="default" r:id="rId21"/>
+      <w:footerReference w:type="default" r:id="rId22"/>
       <w:pgSz w:w="11906" w:h="16838"/>
       <w:pgMar w:top="1418" w:right="1418" w:bottom="1418" w:left="1418" w:header="709" w:footer="709" w:gutter="0"/>
       <w:cols w:space="708"/>
@@ -11660,7 +12169,7 @@
   <w:style w:type="paragraph" w:default="1" w:styleId="Normal">
     <w:name w:val="Normal"/>
     <w:qFormat/>
-    <w:rsid w:val="00042F8D"/>
+    <w:rsid w:val="002A61B1"/>
   </w:style>
   <w:style w:type="paragraph" w:styleId="Titre1">
     <w:name w:val="heading 1"/>

</xml_diff>